<commit_message>
Doku on Video Player Lifecycle
</commit_message>
<xml_diff>
--- a/Requirement new Videoplayer on Scroll.docx
+++ b/Requirement new Videoplayer on Scroll.docx
@@ -4,37 +4,220 @@
   <w:body>
     <w:p>
       <w:r>
-        <w:t>tatsächlich gibt es nur ein einziges PhotoImage-Objekt, das offenbar auch dann weiter existiert, wenn das PIL-Image, aus dem es erzeugt wurde, nicht mehr da ist. Vielleicht kannst Du es in Deine Wissenbasis aufnehmen. Beim Scrolling habe ich eigentlich nur folgendes vor: Ich speichere am Thumbnail, ob das Bild / Video sichtbar ist. Und es gibt eine Liste der zu einem Zeitpunkt sichtbaren Objekte. Nach dem Scrollen prüfe ich für jedes Objekt dieser "visible"-Liste, ob es immer noch sichtbar ist. Falls nein, lösche ich den Video Player, den Ressourcen-Fresser. Dann ermittle ich, welches Objekt als erstes (links) sichtbar ist. Das könnte einPerformance-Problem werden. Am liebsten würde ich durch den Vergleich der bboxes über alle Thumbnails dieses ermitteln. Und dann dafür einen neuen Video Player erzeugen und weiter für alle, die ebenfalls sichtbar sind, was schnell gehen dürfte. Ich würde gern auf irgendwelche dictionaries, die aufgrund der aktuellen bbox-Koordinaten den erste Kandidaten "direkt" finden, verzichten, Was meinst Du, ist der bbox-Abgleich schnell genug, dass man hier auf "brute force" setzen kann?</w:t>
-      </w:r>
-      <w:r>
-        <w:t xml:space="preserve"> – nein, wir haben in tools eine Funktion für binäres Suchen. Die wird verwendet und in get-thumbnail-by-position übernommen.</w:t>
+        <w:t>Problem des verschwundenen PhotoImage Objekts nach Löschen des Video Players</w:t>
       </w:r>
     </w:p>
     <w:p>
       <w:r>
-        <w:t>mir schwebt eher folgendes vor: im Thumbnail speichere ich start- und ende Position in der canvas. wo die Canvas nach dem Scrollen steht(ich unterstüt</w:t>
+        <w:t xml:space="preserve">tatsächlich gibt es nur ein einziges PhotoImage-Objekt, das offenbar auch dann weiter existiert, wenn das PIL-Image, aus dem es erzeugt wurde, nicht mehr da ist. Man muss nur canvas.itemVielleicht kannst Du es in Deine Wissenbasis aufnehmen. </w:t>
       </w:r>
+    </w:p>
+    <w:p/>
+    <w:p>
       <w:r>
-        <w:t>z</w:t>
-      </w:r>
-      <w:r>
-        <w:t>e page up / down , arrow und natürlich auch Ziehen des Sliders, kann ich natürlich ermitteln. jetzt nehmen wir mal an, wir zeigen gerade die ersten 10 Videos an und der Slider labdet in der Mitte der Scrollbar bei Video Nummer 50000. Dann wäre es natürlich idiotisch, bei Vide0 1 anzufangen, aber wie bekomme ich einen sinnvollen Startpunkt?</w:t>
+        <w:t>Verwaltung der Video Player und der Metadaten beim Scrolling</w:t>
       </w:r>
     </w:p>
     <w:p>
       <w:r>
-        <w:t>Das ist ja jetzt eigentlich alles geklärt. Wichtig ist noch: das dict der sichtbaren thumbnails nach dem scrolling neu aufbauen und die Metadaten einlesen und am thumbnail speichern. Anzeige im Tooltip? Oder lieber ein Menüpunkt, das ein Fenster mit einer Tabelle öffnet?</w:t>
+        <w:t xml:space="preserve">Die Player beanspruchen sehr viel Speicher (&gt; 500 MB), so dass wir nur die Videoplayer der sichtbaren Images anzeigen. Dazu speichern wir am Thumbnail, ob das Bild / Video sichtbar ist. Außerdem gibt es ein Dict der zu einem Zeitpunkt sichtbaren Objekte,mit key = canvas-id und value = thumbnail. Wir verwenden die canvas-id als key, weil wir in is_visible die bbox für das canvas-Objekt benötigen. Das sollte aber kein Problem sein, weil wir ja keine Thumbnails löschen. Das passiert nur, wenn wir beispielsweise neu sortieren, aber dann werden ja auch die Ids neu vergeben, so dass alles wieder passt. Für jedes Objekt dieses Dict prüfen wir, ob es nach dem Scrollen immer noch sichtbar ist. Das machen wir, indem wir über das Dict der sichtbaren Images iterieren und prüfen, ob is_visible für die ID True zurückgibt. Falls nein, wird der Video Player gelöscht (wir verzichten auf ein eigenes „visible“-Attribut am thumbnail, da es gepflegt werden müsste und der bbox-Abgleich in is_visible schnell genug ist). Nach dem Scrollen ermitteln wir, welches Objekt als erstes (links) sichtbar ist. Die linke  Position ist canvas_x. Dazu verwenden wir get_thumbnail_by_position, das auf binäres Suchen umgestellt ist, damit es schnell geht. Ein kleines Detail: wir haben ja gaps zwischen den Images und wegen unseres Scroll-Verfahrens steht da möglichweise gar kein Image, sondern ein gap. Deshalb suchen wir statt mit Start mit Start – gap. Dann iterieren wir über die Liste der Thumbnails, beginnend mit dem ersten links, das wir gerade gefunden haben. Wir prüfen, ob der Player None ist. Falls None (noch nie angelegt oder gelöscht), legen wir einen neuen Player an. Das machen wir für alle Images rechts, solange is_visible True ergibt. </w:t>
+      </w:r>
+    </w:p>
+    <w:p>
+      <w:r>
+        <w:t xml:space="preserve">Das dict der sichtbaren thumbnails bauen wir nach dem scrolling neu auf. </w:t>
+      </w:r>
+    </w:p>
+    <w:p>
+      <w:r>
+        <w:t>Wir müssen noch in xview anpassen: Am Ende wird ein itemconfig auf alle thumbnails gemacht, das dürfen wir nur für die in der neu aufgebauten dict visible machen!</w:t>
+      </w:r>
+    </w:p>
+    <w:p/>
+    <w:p>
+      <w:pPr>
+        <w:rPr>
+          <w:color w:val="FF3333"/>
+        </w:rPr>
+      </w:pPr>
+      <w:r>
+        <w:rPr>
+          <w:color w:val="FF3333"/>
+        </w:rPr>
+        <w:t>Kleines Problem: wenn wir zuerst jpegs anzeigen und dann Videos, startet das Video nicht, wenn man mit der Maus darüber fährt und „Restart“ ist ausgegraut. Es liegt daran, dass der Player nach dem Anlegen wieder gelöscht wurde, weil is_visible False zurückgibt. Entweder funktioniert die Funktion is_visible nicht oder es wird eine falsche (veraltete?) ID übergeben.</w:t>
+      </w:r>
+    </w:p>
+    <w:p>
+      <w:pPr>
+        <w:rPr>
+          <w:color w:val="FF3333"/>
+        </w:rPr>
+      </w:pPr>
+      <w:r>
+        <w:rPr>
+          <w:color w:val="FF3333"/>
+        </w:rPr>
+        <w:lastRenderedPageBreak/>
+        <w:t>Lösung: nach dem Scrollen ist die canvas bbox natürlich eine andere. Da wir die Videos aber am Anfang einfügen, sind diese (teilweise) scheinbar nicht mehr sichtbar. Deshalb scrollen wir am Beginn von display_images nach 0.</w:t>
+      </w:r>
+    </w:p>
+    <w:p>
+      <w:pPr>
+        <w:rPr>
+          <w:color w:val="FF3333"/>
+        </w:rPr>
+      </w:pPr>
+    </w:p>
+    <w:p>
+      <w:r>
+        <w:t xml:space="preserve">Für jedes sichtbare prüfen wir, ob die Metadaten schon am Thumbnail vorhanden sind. Falls nicht, lesen wir sie ein und speichern sie am Thumbnail. Das müssen wir auch nach dem Anlegen machen, wenn nicht gescrollt wird, damit die Metadaten für die Images auch zur Verfügung stehen. Also brauchen wir dafür eine eigene Funktion (get_metadata), die wir nach display_images und nach jedem Scrollen aufrufen. </w:t>
+      </w:r>
+    </w:p>
+    <w:p/>
+    <w:p>
+      <w:r>
+        <w:t>Im Tooltip zeigen wir die wichtigsten Metadaten an. Im Kontextmenü machen wir einen neuen Eintrag „show metadata“, der ein eigenes Window mit einer Tabelle öffnet. Die zeigt alle Metadaten, auch wenn sie nicht existieren (z.B. für GPS-Daten, Videodaten), damit der Anwender ein einheitliches Bild bekommt und z.B. erkennen kann, dass es sowas wie GPS-Daten überhaupt gibt.</w:t>
       </w:r>
     </w:p>
     <w:p/>
     <w:sectPr>
       <w:pgSz w:w="11906" w:h="16838"/>
-      <w:pgMar w:top="1417" w:right="1417" w:bottom="1134" w:left="1417" w:header="708" w:footer="708" w:gutter="0"/>
-      <w:cols w:space="708"/>
-      <w:docGrid w:linePitch="360"/>
+      <w:pgMar w:top="1417" w:right="1417" w:bottom="1134" w:left="1417" w:header="720" w:footer="720" w:gutter="0"/>
+      <w:cols w:space="720"/>
+      <w:docGrid w:linePitch="360" w:charSpace="-6145"/>
     </w:sectPr>
   </w:body>
 </w:document>
+</file>
+
+<file path=word/numbering.xml><?xml version="1.0" encoding="utf-8"?>
+<w:numbering xmlns:wpc="http://schemas.microsoft.com/office/word/2010/wordprocessingCanvas" xmlns:cx="http://schemas.microsoft.com/office/drawing/2014/chartex" xmlns:cx1="http://schemas.microsoft.com/office/drawing/2015/9/8/chartex" xmlns:cx2="http://schemas.microsoft.com/office/drawing/2015/10/21/chartex" xmlns:cx3="http://schemas.microsoft.com/office/drawing/2016/5/9/chartex" xmlns:cx4="http://schemas.microsoft.com/office/drawing/2016/5/10/chartex" xmlns:cx5="http://schemas.microsoft.com/office/drawing/2016/5/11/chartex" xmlns:cx6="http://schemas.microsoft.com/office/drawing/2016/5/12/chartex" xmlns:cx7="http://schemas.microsoft.com/office/drawing/2016/5/13/chartex" xmlns:cx8="http://schemas.microsoft.com/office/drawing/2016/5/14/chartex" xmlns:mc="http://schemas.openxmlformats.org/markup-compatibility/2006" xmlns:aink="http://schemas.microsoft.com/office/drawing/2016/ink" xmlns:am3d="http://schemas.microsoft.com/office/drawing/2017/model3d" xmlns:o="urn:schemas-microsoft-com:office:office" xmlns:oel="http://schemas.microsoft.com/office/2019/extlst" xmlns:r="http://schemas.openxmlformats.org/officeDocument/2006/relationships" xmlns:m="http://schemas.openxmlformats.org/officeDocument/2006/math" xmlns:v="urn:schemas-microsoft-com:vml" xmlns:wp14="http://schemas.microsoft.com/office/word/2010/wordprocessingDrawing" xmlns:wp="http://schemas.openxmlformats.org/drawingml/2006/wordprocessingDrawing" xmlns:w10="urn:schemas-microsoft-com:office:word" xmlns:w="http://schemas.openxmlformats.org/wordprocessingml/2006/main" xmlns:w14="http://schemas.microsoft.com/office/word/2010/wordml" xmlns:w15="http://schemas.microsoft.com/office/word/2012/wordml" xmlns:w16cex="http://schemas.microsoft.com/office/word/2018/wordml/cex" xmlns:w16cid="http://schemas.microsoft.com/office/word/2016/wordml/cid" xmlns:w16="http://schemas.microsoft.com/office/word/2018/wordml" xmlns:w16sdtdh="http://schemas.microsoft.com/office/word/2020/wordml/sdtdatahash" xmlns:w16se="http://schemas.microsoft.com/office/word/2015/wordml/symex" xmlns:wpg="http://schemas.microsoft.com/office/word/2010/wordprocessingGroup" xmlns:wpi="http://schemas.microsoft.com/office/word/2010/wordprocessingInk" xmlns:wne="http://schemas.microsoft.com/office/word/2006/wordml" xmlns:wps="http://schemas.microsoft.com/office/word/2010/wordprocessingShape" mc:Ignorable="w14 w15 w16se w16cid w16 w16cex w16sdtdh wp14">
+  <w:abstractNum w:abstractNumId="0" w15:restartNumberingAfterBreak="0">
+    <w:nsid w:val="00000001"/>
+    <w:multiLevelType w:val="multilevel"/>
+    <w:tmpl w:val="00000001"/>
+    <w:lvl w:ilvl="0">
+      <w:start w:val="1"/>
+      <w:numFmt w:val="none"/>
+      <w:suff w:val="nothing"/>
+      <w:lvlText w:val=""/>
+      <w:lvlJc w:val="left"/>
+      <w:pPr>
+        <w:tabs>
+          <w:tab w:val="num" w:pos="432"/>
+        </w:tabs>
+        <w:ind w:left="432" w:hanging="432"/>
+      </w:pPr>
+    </w:lvl>
+    <w:lvl w:ilvl="1">
+      <w:start w:val="1"/>
+      <w:numFmt w:val="none"/>
+      <w:suff w:val="nothing"/>
+      <w:lvlText w:val=""/>
+      <w:lvlJc w:val="left"/>
+      <w:pPr>
+        <w:tabs>
+          <w:tab w:val="num" w:pos="576"/>
+        </w:tabs>
+        <w:ind w:left="576" w:hanging="576"/>
+      </w:pPr>
+    </w:lvl>
+    <w:lvl w:ilvl="2">
+      <w:start w:val="1"/>
+      <w:numFmt w:val="none"/>
+      <w:suff w:val="nothing"/>
+      <w:lvlText w:val=""/>
+      <w:lvlJc w:val="left"/>
+      <w:pPr>
+        <w:tabs>
+          <w:tab w:val="num" w:pos="720"/>
+        </w:tabs>
+        <w:ind w:left="720" w:hanging="720"/>
+      </w:pPr>
+    </w:lvl>
+    <w:lvl w:ilvl="3">
+      <w:start w:val="1"/>
+      <w:numFmt w:val="none"/>
+      <w:suff w:val="nothing"/>
+      <w:lvlText w:val=""/>
+      <w:lvlJc w:val="left"/>
+      <w:pPr>
+        <w:tabs>
+          <w:tab w:val="num" w:pos="864"/>
+        </w:tabs>
+        <w:ind w:left="864" w:hanging="864"/>
+      </w:pPr>
+    </w:lvl>
+    <w:lvl w:ilvl="4">
+      <w:start w:val="1"/>
+      <w:numFmt w:val="none"/>
+      <w:suff w:val="nothing"/>
+      <w:lvlText w:val=""/>
+      <w:lvlJc w:val="left"/>
+      <w:pPr>
+        <w:tabs>
+          <w:tab w:val="num" w:pos="1008"/>
+        </w:tabs>
+        <w:ind w:left="1008" w:hanging="1008"/>
+      </w:pPr>
+    </w:lvl>
+    <w:lvl w:ilvl="5">
+      <w:start w:val="1"/>
+      <w:numFmt w:val="none"/>
+      <w:suff w:val="nothing"/>
+      <w:lvlText w:val=""/>
+      <w:lvlJc w:val="left"/>
+      <w:pPr>
+        <w:tabs>
+          <w:tab w:val="num" w:pos="1152"/>
+        </w:tabs>
+        <w:ind w:left="1152" w:hanging="1152"/>
+      </w:pPr>
+    </w:lvl>
+    <w:lvl w:ilvl="6">
+      <w:start w:val="1"/>
+      <w:numFmt w:val="none"/>
+      <w:suff w:val="nothing"/>
+      <w:lvlText w:val=""/>
+      <w:lvlJc w:val="left"/>
+      <w:pPr>
+        <w:tabs>
+          <w:tab w:val="num" w:pos="1296"/>
+        </w:tabs>
+        <w:ind w:left="1296" w:hanging="1296"/>
+      </w:pPr>
+    </w:lvl>
+    <w:lvl w:ilvl="7">
+      <w:start w:val="1"/>
+      <w:numFmt w:val="none"/>
+      <w:suff w:val="nothing"/>
+      <w:lvlText w:val=""/>
+      <w:lvlJc w:val="left"/>
+      <w:pPr>
+        <w:tabs>
+          <w:tab w:val="num" w:pos="1440"/>
+        </w:tabs>
+        <w:ind w:left="1440" w:hanging="1440"/>
+      </w:pPr>
+    </w:lvl>
+    <w:lvl w:ilvl="8">
+      <w:start w:val="1"/>
+      <w:numFmt w:val="none"/>
+      <w:suff w:val="nothing"/>
+      <w:lvlText w:val=""/>
+      <w:lvlJc w:val="left"/>
+      <w:pPr>
+        <w:tabs>
+          <w:tab w:val="num" w:pos="1584"/>
+        </w:tabs>
+        <w:ind w:left="1584" w:hanging="1584"/>
+      </w:pPr>
+    </w:lvl>
+  </w:abstractNum>
+  <w:num w:numId="1" w16cid:durableId="1187331566">
+    <w:abstractNumId w:val="0"/>
+  </w:num>
+</w:numbering>
 </file>
 
 <file path=word/styles.xml><?xml version="1.0" encoding="utf-8"?>
@@ -42,31 +225,23 @@
   <w:docDefaults>
     <w:rPrDefault>
       <w:rPr>
-        <w:rFonts w:asciiTheme="minorHAnsi" w:eastAsiaTheme="minorHAnsi" w:hAnsiTheme="minorHAnsi" w:cstheme="minorBidi"/>
-        <w:kern w:val="2"/>
-        <w:sz w:val="24"/>
-        <w:szCs w:val="24"/>
-        <w:lang w:val="de-DE" w:eastAsia="en-US" w:bidi="ar-SA"/>
-        <w14:ligatures w14:val="standardContextual"/>
+        <w:rFonts w:ascii="Times New Roman" w:eastAsia="Times New Roman" w:hAnsi="Times New Roman" w:cs="Times New Roman"/>
+        <w:lang w:val="de-DE" w:eastAsia="de-DE" w:bidi="ar-SA"/>
       </w:rPr>
     </w:rPrDefault>
-    <w:pPrDefault>
-      <w:pPr>
-        <w:spacing w:after="160" w:line="278" w:lineRule="auto"/>
-      </w:pPr>
-    </w:pPrDefault>
+    <w:pPrDefault/>
   </w:docDefaults>
   <w:latentStyles w:defLockedState="0" w:defUIPriority="99" w:defSemiHidden="0" w:defUnhideWhenUsed="0" w:defQFormat="0" w:count="376">
     <w:lsdException w:name="Normal" w:uiPriority="0" w:qFormat="1"/>
     <w:lsdException w:name="heading 1" w:uiPriority="9" w:qFormat="1"/>
-    <w:lsdException w:name="heading 2" w:semiHidden="1" w:uiPriority="9" w:unhideWhenUsed="1" w:qFormat="1"/>
-    <w:lsdException w:name="heading 3" w:semiHidden="1" w:uiPriority="9" w:unhideWhenUsed="1" w:qFormat="1"/>
-    <w:lsdException w:name="heading 4" w:semiHidden="1" w:uiPriority="9" w:unhideWhenUsed="1" w:qFormat="1"/>
-    <w:lsdException w:name="heading 5" w:semiHidden="1" w:uiPriority="9" w:unhideWhenUsed="1" w:qFormat="1"/>
-    <w:lsdException w:name="heading 6" w:semiHidden="1" w:uiPriority="9" w:unhideWhenUsed="1" w:qFormat="1"/>
-    <w:lsdException w:name="heading 7" w:semiHidden="1" w:uiPriority="9" w:unhideWhenUsed="1" w:qFormat="1"/>
-    <w:lsdException w:name="heading 8" w:semiHidden="1" w:uiPriority="9" w:unhideWhenUsed="1" w:qFormat="1"/>
-    <w:lsdException w:name="heading 9" w:semiHidden="1" w:uiPriority="9" w:unhideWhenUsed="1" w:qFormat="1"/>
+    <w:lsdException w:name="heading 2" w:uiPriority="9" w:qFormat="1"/>
+    <w:lsdException w:name="heading 3" w:uiPriority="9" w:qFormat="1"/>
+    <w:lsdException w:name="heading 4" w:uiPriority="9" w:qFormat="1"/>
+    <w:lsdException w:name="heading 5" w:uiPriority="9" w:qFormat="1"/>
+    <w:lsdException w:name="heading 6" w:uiPriority="9" w:qFormat="1"/>
+    <w:lsdException w:name="heading 7" w:uiPriority="9" w:qFormat="1"/>
+    <w:lsdException w:name="heading 8" w:uiPriority="9" w:qFormat="1"/>
+    <w:lsdException w:name="heading 9" w:uiPriority="9" w:qFormat="1"/>
     <w:lsdException w:name="index 1" w:semiHidden="1" w:unhideWhenUsed="1"/>
     <w:lsdException w:name="index 2" w:semiHidden="1" w:unhideWhenUsed="1"/>
     <w:lsdException w:name="index 3" w:semiHidden="1" w:unhideWhenUsed="1"/>
@@ -437,24 +612,35 @@
   <w:style w:type="paragraph" w:default="1" w:styleId="Standard">
     <w:name w:val="Normal"/>
     <w:qFormat/>
+    <w:pPr>
+      <w:suppressAutoHyphens/>
+      <w:spacing w:after="160" w:line="276" w:lineRule="auto"/>
+    </w:pPr>
+    <w:rPr>
+      <w:rFonts w:ascii="Aptos" w:eastAsia="SimSun" w:hAnsi="Aptos" w:cs="font1307"/>
+      <w:kern w:val="1"/>
+      <w:sz w:val="24"/>
+      <w:szCs w:val="24"/>
+      <w:lang w:eastAsia="ar-SA"/>
+    </w:rPr>
   </w:style>
   <w:style w:type="paragraph" w:styleId="berschrift1">
     <w:name w:val="heading 1"/>
     <w:basedOn w:val="Standard"/>
-    <w:next w:val="Standard"/>
-    <w:link w:val="berschrift1Zchn"/>
-    <w:uiPriority w:val="9"/>
+    <w:next w:val="Textkrper"/>
     <w:qFormat/>
-    <w:rsid w:val="004C77BB"/>
     <w:pPr>
       <w:keepNext/>
       <w:keepLines/>
+      <w:numPr>
+        <w:numId w:val="1"/>
+      </w:numPr>
       <w:spacing w:before="360" w:after="80"/>
       <w:outlineLvl w:val="0"/>
     </w:pPr>
     <w:rPr>
-      <w:rFonts w:asciiTheme="majorHAnsi" w:eastAsiaTheme="majorEastAsia" w:hAnsiTheme="majorHAnsi" w:cstheme="majorBidi"/>
-      <w:color w:val="0F4761" w:themeColor="accent1" w:themeShade="BF"/>
+      <w:rFonts w:ascii="Aptos Display" w:hAnsi="Aptos Display"/>
+      <w:color w:val="0F4761"/>
       <w:sz w:val="40"/>
       <w:szCs w:val="40"/>
     </w:rPr>
@@ -462,22 +648,21 @@
   <w:style w:type="paragraph" w:styleId="berschrift2">
     <w:name w:val="heading 2"/>
     <w:basedOn w:val="Standard"/>
-    <w:next w:val="Standard"/>
-    <w:link w:val="berschrift2Zchn"/>
-    <w:uiPriority w:val="9"/>
-    <w:semiHidden/>
-    <w:unhideWhenUsed/>
+    <w:next w:val="Textkrper"/>
     <w:qFormat/>
-    <w:rsid w:val="004C77BB"/>
     <w:pPr>
       <w:keepNext/>
       <w:keepLines/>
+      <w:numPr>
+        <w:ilvl w:val="1"/>
+        <w:numId w:val="1"/>
+      </w:numPr>
       <w:spacing w:before="160" w:after="80"/>
       <w:outlineLvl w:val="1"/>
     </w:pPr>
     <w:rPr>
-      <w:rFonts w:asciiTheme="majorHAnsi" w:eastAsiaTheme="majorEastAsia" w:hAnsiTheme="majorHAnsi" w:cstheme="majorBidi"/>
-      <w:color w:val="0F4761" w:themeColor="accent1" w:themeShade="BF"/>
+      <w:rFonts w:ascii="Aptos Display" w:hAnsi="Aptos Display"/>
+      <w:color w:val="0F4761"/>
       <w:sz w:val="32"/>
       <w:szCs w:val="32"/>
     </w:rPr>
@@ -485,22 +670,20 @@
   <w:style w:type="paragraph" w:styleId="berschrift3">
     <w:name w:val="heading 3"/>
     <w:basedOn w:val="Standard"/>
-    <w:next w:val="Standard"/>
-    <w:link w:val="berschrift3Zchn"/>
-    <w:uiPriority w:val="9"/>
-    <w:semiHidden/>
-    <w:unhideWhenUsed/>
+    <w:next w:val="Textkrper"/>
     <w:qFormat/>
-    <w:rsid w:val="004C77BB"/>
     <w:pPr>
       <w:keepNext/>
       <w:keepLines/>
+      <w:numPr>
+        <w:ilvl w:val="2"/>
+        <w:numId w:val="1"/>
+      </w:numPr>
       <w:spacing w:before="160" w:after="80"/>
       <w:outlineLvl w:val="2"/>
     </w:pPr>
     <w:rPr>
-      <w:rFonts w:eastAsiaTheme="majorEastAsia" w:cstheme="majorBidi"/>
-      <w:color w:val="0F4761" w:themeColor="accent1" w:themeShade="BF"/>
+      <w:color w:val="0F4761"/>
       <w:sz w:val="28"/>
       <w:szCs w:val="28"/>
     </w:rPr>
@@ -508,133 +691,121 @@
   <w:style w:type="paragraph" w:styleId="berschrift4">
     <w:name w:val="heading 4"/>
     <w:basedOn w:val="Standard"/>
-    <w:next w:val="Standard"/>
-    <w:link w:val="berschrift4Zchn"/>
-    <w:uiPriority w:val="9"/>
-    <w:semiHidden/>
-    <w:unhideWhenUsed/>
+    <w:next w:val="Textkrper"/>
     <w:qFormat/>
-    <w:rsid w:val="004C77BB"/>
     <w:pPr>
       <w:keepNext/>
       <w:keepLines/>
+      <w:numPr>
+        <w:ilvl w:val="3"/>
+        <w:numId w:val="1"/>
+      </w:numPr>
       <w:spacing w:before="80" w:after="40"/>
       <w:outlineLvl w:val="3"/>
     </w:pPr>
     <w:rPr>
-      <w:rFonts w:eastAsiaTheme="majorEastAsia" w:cstheme="majorBidi"/>
       <w:i/>
       <w:iCs/>
-      <w:color w:val="0F4761" w:themeColor="accent1" w:themeShade="BF"/>
+      <w:color w:val="0F4761"/>
     </w:rPr>
   </w:style>
   <w:style w:type="paragraph" w:styleId="berschrift5">
     <w:name w:val="heading 5"/>
     <w:basedOn w:val="Standard"/>
-    <w:next w:val="Standard"/>
-    <w:link w:val="berschrift5Zchn"/>
-    <w:uiPriority w:val="9"/>
-    <w:semiHidden/>
-    <w:unhideWhenUsed/>
+    <w:next w:val="Textkrper"/>
     <w:qFormat/>
-    <w:rsid w:val="004C77BB"/>
     <w:pPr>
       <w:keepNext/>
       <w:keepLines/>
+      <w:numPr>
+        <w:ilvl w:val="4"/>
+        <w:numId w:val="1"/>
+      </w:numPr>
       <w:spacing w:before="80" w:after="40"/>
       <w:outlineLvl w:val="4"/>
     </w:pPr>
     <w:rPr>
-      <w:rFonts w:eastAsiaTheme="majorEastAsia" w:cstheme="majorBidi"/>
-      <w:color w:val="0F4761" w:themeColor="accent1" w:themeShade="BF"/>
+      <w:color w:val="0F4761"/>
     </w:rPr>
   </w:style>
   <w:style w:type="paragraph" w:styleId="berschrift6">
     <w:name w:val="heading 6"/>
     <w:basedOn w:val="Standard"/>
-    <w:next w:val="Standard"/>
-    <w:link w:val="berschrift6Zchn"/>
-    <w:uiPriority w:val="9"/>
-    <w:semiHidden/>
-    <w:unhideWhenUsed/>
+    <w:next w:val="Textkrper"/>
     <w:qFormat/>
-    <w:rsid w:val="004C77BB"/>
     <w:pPr>
       <w:keepNext/>
       <w:keepLines/>
+      <w:numPr>
+        <w:ilvl w:val="5"/>
+        <w:numId w:val="1"/>
+      </w:numPr>
       <w:spacing w:before="40" w:after="0"/>
       <w:outlineLvl w:val="5"/>
     </w:pPr>
     <w:rPr>
-      <w:rFonts w:eastAsiaTheme="majorEastAsia" w:cstheme="majorBidi"/>
       <w:i/>
       <w:iCs/>
-      <w:color w:val="595959" w:themeColor="text1" w:themeTint="A6"/>
+      <w:color w:val="595959"/>
     </w:rPr>
   </w:style>
   <w:style w:type="paragraph" w:styleId="berschrift7">
     <w:name w:val="heading 7"/>
     <w:basedOn w:val="Standard"/>
-    <w:next w:val="Standard"/>
-    <w:link w:val="berschrift7Zchn"/>
-    <w:uiPriority w:val="9"/>
-    <w:semiHidden/>
-    <w:unhideWhenUsed/>
+    <w:next w:val="Textkrper"/>
     <w:qFormat/>
-    <w:rsid w:val="004C77BB"/>
     <w:pPr>
       <w:keepNext/>
       <w:keepLines/>
+      <w:numPr>
+        <w:ilvl w:val="6"/>
+        <w:numId w:val="1"/>
+      </w:numPr>
       <w:spacing w:before="40" w:after="0"/>
       <w:outlineLvl w:val="6"/>
     </w:pPr>
     <w:rPr>
-      <w:rFonts w:eastAsiaTheme="majorEastAsia" w:cstheme="majorBidi"/>
-      <w:color w:val="595959" w:themeColor="text1" w:themeTint="A6"/>
+      <w:color w:val="595959"/>
     </w:rPr>
   </w:style>
   <w:style w:type="paragraph" w:styleId="berschrift8">
     <w:name w:val="heading 8"/>
     <w:basedOn w:val="Standard"/>
-    <w:next w:val="Standard"/>
-    <w:link w:val="berschrift8Zchn"/>
-    <w:uiPriority w:val="9"/>
-    <w:semiHidden/>
-    <w:unhideWhenUsed/>
+    <w:next w:val="Textkrper"/>
     <w:qFormat/>
-    <w:rsid w:val="004C77BB"/>
     <w:pPr>
       <w:keepNext/>
       <w:keepLines/>
+      <w:numPr>
+        <w:ilvl w:val="7"/>
+        <w:numId w:val="1"/>
+      </w:numPr>
       <w:spacing w:after="0"/>
       <w:outlineLvl w:val="7"/>
     </w:pPr>
     <w:rPr>
-      <w:rFonts w:eastAsiaTheme="majorEastAsia" w:cstheme="majorBidi"/>
       <w:i/>
       <w:iCs/>
-      <w:color w:val="272727" w:themeColor="text1" w:themeTint="D8"/>
+      <w:color w:val="272727"/>
     </w:rPr>
   </w:style>
   <w:style w:type="paragraph" w:styleId="berschrift9">
     <w:name w:val="heading 9"/>
     <w:basedOn w:val="Standard"/>
-    <w:next w:val="Standard"/>
-    <w:link w:val="berschrift9Zchn"/>
-    <w:uiPriority w:val="9"/>
-    <w:semiHidden/>
-    <w:unhideWhenUsed/>
+    <w:next w:val="Textkrper"/>
     <w:qFormat/>
-    <w:rsid w:val="004C77BB"/>
     <w:pPr>
       <w:keepNext/>
       <w:keepLines/>
+      <w:numPr>
+        <w:ilvl w:val="8"/>
+        <w:numId w:val="1"/>
+      </w:numPr>
       <w:spacing w:after="0"/>
       <w:outlineLvl w:val="8"/>
     </w:pPr>
     <w:rPr>
-      <w:rFonts w:eastAsiaTheme="majorEastAsia" w:cstheme="majorBidi"/>
-      <w:color w:val="272727" w:themeColor="text1" w:themeTint="D8"/>
+      <w:color w:val="272727"/>
     </w:rPr>
   </w:style>
   <w:style w:type="character" w:default="1" w:styleId="Absatz-Standardschriftart">
@@ -664,202 +835,238 @@
     <w:semiHidden/>
     <w:unhideWhenUsed/>
   </w:style>
+  <w:style w:type="character" w:customStyle="1" w:styleId="DefaultParagraphFont">
+    <w:name w:val="Default Paragraph Font"/>
+  </w:style>
   <w:style w:type="character" w:customStyle="1" w:styleId="berschrift1Zchn">
     <w:name w:val="Überschrift 1 Zchn"/>
-    <w:basedOn w:val="Absatz-Standardschriftart"/>
-    <w:link w:val="berschrift1"/>
-    <w:uiPriority w:val="9"/>
-    <w:rsid w:val="004C77BB"/>
-    <w:rPr>
-      <w:rFonts w:asciiTheme="majorHAnsi" w:eastAsiaTheme="majorEastAsia" w:hAnsiTheme="majorHAnsi" w:cstheme="majorBidi"/>
-      <w:color w:val="0F4761" w:themeColor="accent1" w:themeShade="BF"/>
+    <w:basedOn w:val="DefaultParagraphFont"/>
+    <w:rPr>
+      <w:rFonts w:ascii="Aptos Display" w:hAnsi="Aptos Display" w:cs="font1307"/>
+      <w:color w:val="0F4761"/>
       <w:sz w:val="40"/>
       <w:szCs w:val="40"/>
     </w:rPr>
   </w:style>
   <w:style w:type="character" w:customStyle="1" w:styleId="berschrift2Zchn">
     <w:name w:val="Überschrift 2 Zchn"/>
-    <w:basedOn w:val="Absatz-Standardschriftart"/>
-    <w:link w:val="berschrift2"/>
-    <w:uiPriority w:val="9"/>
-    <w:semiHidden/>
-    <w:rsid w:val="004C77BB"/>
-    <w:rPr>
-      <w:rFonts w:asciiTheme="majorHAnsi" w:eastAsiaTheme="majorEastAsia" w:hAnsiTheme="majorHAnsi" w:cstheme="majorBidi"/>
-      <w:color w:val="0F4761" w:themeColor="accent1" w:themeShade="BF"/>
+    <w:basedOn w:val="DefaultParagraphFont"/>
+    <w:rPr>
+      <w:rFonts w:ascii="Aptos Display" w:hAnsi="Aptos Display" w:cs="font1307"/>
+      <w:color w:val="0F4761"/>
       <w:sz w:val="32"/>
       <w:szCs w:val="32"/>
     </w:rPr>
   </w:style>
   <w:style w:type="character" w:customStyle="1" w:styleId="berschrift3Zchn">
     <w:name w:val="Überschrift 3 Zchn"/>
-    <w:basedOn w:val="Absatz-Standardschriftart"/>
-    <w:link w:val="berschrift3"/>
-    <w:uiPriority w:val="9"/>
-    <w:semiHidden/>
-    <w:rsid w:val="004C77BB"/>
-    <w:rPr>
-      <w:rFonts w:eastAsiaTheme="majorEastAsia" w:cstheme="majorBidi"/>
-      <w:color w:val="0F4761" w:themeColor="accent1" w:themeShade="BF"/>
+    <w:basedOn w:val="DefaultParagraphFont"/>
+    <w:rPr>
+      <w:rFonts w:cs="font1307"/>
+      <w:color w:val="0F4761"/>
       <w:sz w:val="28"/>
       <w:szCs w:val="28"/>
     </w:rPr>
   </w:style>
   <w:style w:type="character" w:customStyle="1" w:styleId="berschrift4Zchn">
     <w:name w:val="Überschrift 4 Zchn"/>
-    <w:basedOn w:val="Absatz-Standardschriftart"/>
-    <w:link w:val="berschrift4"/>
-    <w:uiPriority w:val="9"/>
-    <w:semiHidden/>
-    <w:rsid w:val="004C77BB"/>
-    <w:rPr>
-      <w:rFonts w:eastAsiaTheme="majorEastAsia" w:cstheme="majorBidi"/>
+    <w:basedOn w:val="DefaultParagraphFont"/>
+    <w:rPr>
+      <w:rFonts w:cs="font1307"/>
       <w:i/>
       <w:iCs/>
-      <w:color w:val="0F4761" w:themeColor="accent1" w:themeShade="BF"/>
+      <w:color w:val="0F4761"/>
     </w:rPr>
   </w:style>
   <w:style w:type="character" w:customStyle="1" w:styleId="berschrift5Zchn">
     <w:name w:val="Überschrift 5 Zchn"/>
-    <w:basedOn w:val="Absatz-Standardschriftart"/>
-    <w:link w:val="berschrift5"/>
-    <w:uiPriority w:val="9"/>
-    <w:semiHidden/>
-    <w:rsid w:val="004C77BB"/>
-    <w:rPr>
-      <w:rFonts w:eastAsiaTheme="majorEastAsia" w:cstheme="majorBidi"/>
-      <w:color w:val="0F4761" w:themeColor="accent1" w:themeShade="BF"/>
+    <w:basedOn w:val="DefaultParagraphFont"/>
+    <w:rPr>
+      <w:rFonts w:cs="font1307"/>
+      <w:color w:val="0F4761"/>
     </w:rPr>
   </w:style>
   <w:style w:type="character" w:customStyle="1" w:styleId="berschrift6Zchn">
     <w:name w:val="Überschrift 6 Zchn"/>
-    <w:basedOn w:val="Absatz-Standardschriftart"/>
-    <w:link w:val="berschrift6"/>
-    <w:uiPriority w:val="9"/>
-    <w:semiHidden/>
-    <w:rsid w:val="004C77BB"/>
-    <w:rPr>
-      <w:rFonts w:eastAsiaTheme="majorEastAsia" w:cstheme="majorBidi"/>
+    <w:basedOn w:val="DefaultParagraphFont"/>
+    <w:rPr>
+      <w:rFonts w:cs="font1307"/>
       <w:i/>
       <w:iCs/>
-      <w:color w:val="595959" w:themeColor="text1" w:themeTint="A6"/>
+      <w:color w:val="595959"/>
     </w:rPr>
   </w:style>
   <w:style w:type="character" w:customStyle="1" w:styleId="berschrift7Zchn">
     <w:name w:val="Überschrift 7 Zchn"/>
-    <w:basedOn w:val="Absatz-Standardschriftart"/>
-    <w:link w:val="berschrift7"/>
-    <w:uiPriority w:val="9"/>
-    <w:semiHidden/>
-    <w:rsid w:val="004C77BB"/>
-    <w:rPr>
-      <w:rFonts w:eastAsiaTheme="majorEastAsia" w:cstheme="majorBidi"/>
-      <w:color w:val="595959" w:themeColor="text1" w:themeTint="A6"/>
+    <w:basedOn w:val="DefaultParagraphFont"/>
+    <w:rPr>
+      <w:rFonts w:cs="font1307"/>
+      <w:color w:val="595959"/>
     </w:rPr>
   </w:style>
   <w:style w:type="character" w:customStyle="1" w:styleId="berschrift8Zchn">
     <w:name w:val="Überschrift 8 Zchn"/>
-    <w:basedOn w:val="Absatz-Standardschriftart"/>
-    <w:link w:val="berschrift8"/>
-    <w:uiPriority w:val="9"/>
-    <w:semiHidden/>
-    <w:rsid w:val="004C77BB"/>
-    <w:rPr>
-      <w:rFonts w:eastAsiaTheme="majorEastAsia" w:cstheme="majorBidi"/>
+    <w:basedOn w:val="DefaultParagraphFont"/>
+    <w:rPr>
+      <w:rFonts w:cs="font1307"/>
       <w:i/>
       <w:iCs/>
-      <w:color w:val="272727" w:themeColor="text1" w:themeTint="D8"/>
+      <w:color w:val="272727"/>
     </w:rPr>
   </w:style>
   <w:style w:type="character" w:customStyle="1" w:styleId="berschrift9Zchn">
     <w:name w:val="Überschrift 9 Zchn"/>
-    <w:basedOn w:val="Absatz-Standardschriftart"/>
-    <w:link w:val="berschrift9"/>
-    <w:uiPriority w:val="9"/>
-    <w:semiHidden/>
-    <w:rsid w:val="004C77BB"/>
-    <w:rPr>
-      <w:rFonts w:eastAsiaTheme="majorEastAsia" w:cstheme="majorBidi"/>
-      <w:color w:val="272727" w:themeColor="text1" w:themeTint="D8"/>
-    </w:rPr>
-  </w:style>
-  <w:style w:type="paragraph" w:styleId="Titel">
-    <w:name w:val="Title"/>
-    <w:basedOn w:val="Standard"/>
-    <w:next w:val="Standard"/>
-    <w:link w:val="TitelZchn"/>
-    <w:uiPriority w:val="10"/>
-    <w:qFormat/>
-    <w:rsid w:val="004C77BB"/>
-    <w:pPr>
-      <w:spacing w:after="80" w:line="240" w:lineRule="auto"/>
-      <w:contextualSpacing/>
-    </w:pPr>
-    <w:rPr>
-      <w:rFonts w:asciiTheme="majorHAnsi" w:eastAsiaTheme="majorEastAsia" w:hAnsiTheme="majorHAnsi" w:cstheme="majorBidi"/>
+    <w:basedOn w:val="DefaultParagraphFont"/>
+    <w:rPr>
+      <w:rFonts w:cs="font1307"/>
+      <w:color w:val="272727"/>
+    </w:rPr>
+  </w:style>
+  <w:style w:type="character" w:customStyle="1" w:styleId="TitelZchn">
+    <w:name w:val="Titel Zchn"/>
+    <w:basedOn w:val="DefaultParagraphFont"/>
+    <w:rPr>
+      <w:rFonts w:ascii="Aptos Display" w:hAnsi="Aptos Display" w:cs="font1307"/>
       <w:spacing w:val="-10"/>
-      <w:kern w:val="28"/>
+      <w:kern w:val="1"/>
       <w:sz w:val="56"/>
       <w:szCs w:val="56"/>
     </w:rPr>
   </w:style>
-  <w:style w:type="character" w:customStyle="1" w:styleId="TitelZchn">
-    <w:name w:val="Titel Zchn"/>
-    <w:basedOn w:val="Absatz-Standardschriftart"/>
-    <w:link w:val="Titel"/>
-    <w:uiPriority w:val="10"/>
-    <w:rsid w:val="004C77BB"/>
-    <w:rPr>
-      <w:rFonts w:asciiTheme="majorHAnsi" w:eastAsiaTheme="majorEastAsia" w:hAnsiTheme="majorHAnsi" w:cstheme="majorBidi"/>
-      <w:spacing w:val="-10"/>
-      <w:kern w:val="28"/>
-      <w:sz w:val="56"/>
-      <w:szCs w:val="56"/>
-    </w:rPr>
-  </w:style>
-  <w:style w:type="paragraph" w:styleId="Untertitel">
-    <w:name w:val="Subtitle"/>
-    <w:basedOn w:val="Standard"/>
-    <w:next w:val="Standard"/>
-    <w:link w:val="UntertitelZchn"/>
-    <w:uiPriority w:val="11"/>
-    <w:qFormat/>
-    <w:rsid w:val="004C77BB"/>
-    <w:pPr>
-      <w:numPr>
-        <w:ilvl w:val="1"/>
-      </w:numPr>
-    </w:pPr>
-    <w:rPr>
-      <w:rFonts w:eastAsiaTheme="majorEastAsia" w:cstheme="majorBidi"/>
-      <w:color w:val="595959" w:themeColor="text1" w:themeTint="A6"/>
+  <w:style w:type="character" w:customStyle="1" w:styleId="UntertitelZchn">
+    <w:name w:val="Untertitel Zchn"/>
+    <w:basedOn w:val="DefaultParagraphFont"/>
+    <w:rPr>
+      <w:rFonts w:cs="font1307"/>
+      <w:color w:val="595959"/>
       <w:spacing w:val="15"/>
       <w:sz w:val="28"/>
       <w:szCs w:val="28"/>
     </w:rPr>
   </w:style>
-  <w:style w:type="character" w:customStyle="1" w:styleId="UntertitelZchn">
-    <w:name w:val="Untertitel Zchn"/>
-    <w:basedOn w:val="Absatz-Standardschriftart"/>
-    <w:link w:val="Untertitel"/>
-    <w:uiPriority w:val="11"/>
-    <w:rsid w:val="004C77BB"/>
-    <w:rPr>
-      <w:rFonts w:eastAsiaTheme="majorEastAsia" w:cstheme="majorBidi"/>
-      <w:color w:val="595959" w:themeColor="text1" w:themeTint="A6"/>
+  <w:style w:type="character" w:customStyle="1" w:styleId="ZitatZchn">
+    <w:name w:val="Zitat Zchn"/>
+    <w:basedOn w:val="DefaultParagraphFont"/>
+    <w:rPr>
+      <w:i/>
+      <w:iCs/>
+      <w:color w:val="404040"/>
+    </w:rPr>
+  </w:style>
+  <w:style w:type="character" w:customStyle="1" w:styleId="IntenseEmphasis">
+    <w:name w:val="Intense Emphasis"/>
+    <w:basedOn w:val="DefaultParagraphFont"/>
+    <w:rPr>
+      <w:i/>
+      <w:iCs/>
+      <w:color w:val="0F4761"/>
+    </w:rPr>
+  </w:style>
+  <w:style w:type="character" w:customStyle="1" w:styleId="IntensivesZitatZchn">
+    <w:name w:val="Intensives Zitat Zchn"/>
+    <w:basedOn w:val="DefaultParagraphFont"/>
+    <w:rPr>
+      <w:i/>
+      <w:iCs/>
+      <w:color w:val="0F4761"/>
+    </w:rPr>
+  </w:style>
+  <w:style w:type="character" w:customStyle="1" w:styleId="IntenseReference">
+    <w:name w:val="Intense Reference"/>
+    <w:basedOn w:val="DefaultParagraphFont"/>
+    <w:rPr>
+      <w:b/>
+      <w:bCs/>
+      <w:smallCaps/>
+      <w:color w:val="0F4761"/>
+      <w:spacing w:val="5"/>
+    </w:rPr>
+  </w:style>
+  <w:style w:type="paragraph" w:customStyle="1" w:styleId="berschrift">
+    <w:name w:val="Überschrift"/>
+    <w:basedOn w:val="Standard"/>
+    <w:next w:val="Textkrper"/>
+    <w:pPr>
+      <w:keepNext/>
+      <w:spacing w:before="240" w:after="120"/>
+    </w:pPr>
+    <w:rPr>
+      <w:rFonts w:ascii="Arial" w:eastAsia="Microsoft YaHei" w:hAnsi="Arial" w:cs="Lucida Sans"/>
+      <w:sz w:val="28"/>
+      <w:szCs w:val="28"/>
+    </w:rPr>
+  </w:style>
+  <w:style w:type="paragraph" w:styleId="Textkrper">
+    <w:name w:val="Body Text"/>
+    <w:basedOn w:val="Standard"/>
+    <w:pPr>
+      <w:spacing w:after="120"/>
+    </w:pPr>
+  </w:style>
+  <w:style w:type="paragraph" w:styleId="Liste">
+    <w:name w:val="List"/>
+    <w:basedOn w:val="Textkrper"/>
+    <w:rPr>
+      <w:rFonts w:cs="Lucida Sans"/>
+    </w:rPr>
+  </w:style>
+  <w:style w:type="paragraph" w:customStyle="1" w:styleId="Beschriftung1">
+    <w:name w:val="Beschriftung1"/>
+    <w:basedOn w:val="Standard"/>
+    <w:pPr>
+      <w:suppressLineNumbers/>
+      <w:spacing w:before="120" w:after="120"/>
+    </w:pPr>
+    <w:rPr>
+      <w:rFonts w:cs="Lucida Sans"/>
+      <w:i/>
+      <w:iCs/>
+    </w:rPr>
+  </w:style>
+  <w:style w:type="paragraph" w:customStyle="1" w:styleId="Verzeichnis">
+    <w:name w:val="Verzeichnis"/>
+    <w:basedOn w:val="Standard"/>
+    <w:pPr>
+      <w:suppressLineNumbers/>
+    </w:pPr>
+    <w:rPr>
+      <w:rFonts w:cs="Lucida Sans"/>
+    </w:rPr>
+  </w:style>
+  <w:style w:type="paragraph" w:styleId="Titel">
+    <w:name w:val="Title"/>
+    <w:basedOn w:val="Standard"/>
+    <w:next w:val="Untertitel"/>
+    <w:qFormat/>
+    <w:pPr>
+      <w:spacing w:after="80" w:line="100" w:lineRule="atLeast"/>
+    </w:pPr>
+    <w:rPr>
+      <w:rFonts w:ascii="Aptos Display" w:hAnsi="Aptos Display"/>
+      <w:b/>
+      <w:bCs/>
+      <w:spacing w:val="-10"/>
+      <w:sz w:val="56"/>
+      <w:szCs w:val="56"/>
+    </w:rPr>
+  </w:style>
+  <w:style w:type="paragraph" w:styleId="Untertitel">
+    <w:name w:val="Subtitle"/>
+    <w:basedOn w:val="Standard"/>
+    <w:next w:val="Textkrper"/>
+    <w:qFormat/>
+    <w:rPr>
+      <w:i/>
+      <w:iCs/>
+      <w:color w:val="595959"/>
       <w:spacing w:val="15"/>
       <w:sz w:val="28"/>
       <w:szCs w:val="28"/>
     </w:rPr>
   </w:style>
-  <w:style w:type="paragraph" w:styleId="Zitat">
+  <w:style w:type="paragraph" w:customStyle="1" w:styleId="Quote">
     <w:name w:val="Quote"/>
     <w:basedOn w:val="Standard"/>
-    <w:next w:val="Standard"/>
-    <w:link w:val="ZitatZchn"/>
-    <w:uiPriority w:val="29"/>
-    <w:qFormat/>
-    <w:rsid w:val="004C77BB"/>
     <w:pPr>
       <w:spacing w:before="160"/>
       <w:jc w:val="center"/>
@@ -867,56 +1074,23 @@
     <w:rPr>
       <w:i/>
       <w:iCs/>
-      <w:color w:val="404040" w:themeColor="text1" w:themeTint="BF"/>
-    </w:rPr>
-  </w:style>
-  <w:style w:type="character" w:customStyle="1" w:styleId="ZitatZchn">
-    <w:name w:val="Zitat Zchn"/>
-    <w:basedOn w:val="Absatz-Standardschriftart"/>
-    <w:link w:val="Zitat"/>
-    <w:uiPriority w:val="29"/>
-    <w:rsid w:val="004C77BB"/>
-    <w:rPr>
-      <w:i/>
-      <w:iCs/>
-      <w:color w:val="404040" w:themeColor="text1" w:themeTint="BF"/>
-    </w:rPr>
-  </w:style>
-  <w:style w:type="paragraph" w:styleId="Listenabsatz">
+      <w:color w:val="404040"/>
+    </w:rPr>
+  </w:style>
+  <w:style w:type="paragraph" w:customStyle="1" w:styleId="ListParagraph">
     <w:name w:val="List Paragraph"/>
     <w:basedOn w:val="Standard"/>
-    <w:uiPriority w:val="34"/>
-    <w:qFormat/>
-    <w:rsid w:val="004C77BB"/>
     <w:pPr>
       <w:ind w:left="720"/>
-      <w:contextualSpacing/>
-    </w:pPr>
-  </w:style>
-  <w:style w:type="character" w:styleId="IntensiveHervorhebung">
-    <w:name w:val="Intense Emphasis"/>
-    <w:basedOn w:val="Absatz-Standardschriftart"/>
-    <w:uiPriority w:val="21"/>
-    <w:qFormat/>
-    <w:rsid w:val="004C77BB"/>
-    <w:rPr>
-      <w:i/>
-      <w:iCs/>
-      <w:color w:val="0F4761" w:themeColor="accent1" w:themeShade="BF"/>
-    </w:rPr>
-  </w:style>
-  <w:style w:type="paragraph" w:styleId="IntensivesZitat">
+    </w:pPr>
+  </w:style>
+  <w:style w:type="paragraph" w:customStyle="1" w:styleId="IntenseQuote">
     <w:name w:val="Intense Quote"/>
     <w:basedOn w:val="Standard"/>
-    <w:next w:val="Standard"/>
-    <w:link w:val="IntensivesZitatZchn"/>
-    <w:uiPriority w:val="30"/>
-    <w:qFormat/>
-    <w:rsid w:val="004C77BB"/>
     <w:pPr>
       <w:pBdr>
-        <w:top w:val="single" w:sz="4" w:space="10" w:color="0F4761" w:themeColor="accent1" w:themeShade="BF"/>
-        <w:bottom w:val="single" w:sz="4" w:space="10" w:color="0F4761" w:themeColor="accent1" w:themeShade="BF"/>
+        <w:top w:val="single" w:sz="4" w:space="10" w:color="008080"/>
+        <w:bottom w:val="single" w:sz="4" w:space="10" w:color="008080"/>
       </w:pBdr>
       <w:spacing w:before="360" w:after="360"/>
       <w:ind w:left="864" w:right="864"/>
@@ -925,33 +1099,7 @@
     <w:rPr>
       <w:i/>
       <w:iCs/>
-      <w:color w:val="0F4761" w:themeColor="accent1" w:themeShade="BF"/>
-    </w:rPr>
-  </w:style>
-  <w:style w:type="character" w:customStyle="1" w:styleId="IntensivesZitatZchn">
-    <w:name w:val="Intensives Zitat Zchn"/>
-    <w:basedOn w:val="Absatz-Standardschriftart"/>
-    <w:link w:val="IntensivesZitat"/>
-    <w:uiPriority w:val="30"/>
-    <w:rsid w:val="004C77BB"/>
-    <w:rPr>
-      <w:i/>
-      <w:iCs/>
-      <w:color w:val="0F4761" w:themeColor="accent1" w:themeShade="BF"/>
-    </w:rPr>
-  </w:style>
-  <w:style w:type="character" w:styleId="IntensiverVerweis">
-    <w:name w:val="Intense Reference"/>
-    <w:basedOn w:val="Absatz-Standardschriftart"/>
-    <w:uiPriority w:val="32"/>
-    <w:qFormat/>
-    <w:rsid w:val="004C77BB"/>
-    <w:rPr>
-      <w:b/>
-      <w:bCs/>
-      <w:smallCaps/>
-      <w:color w:val="0F4761" w:themeColor="accent1" w:themeShade="BF"/>
-      <w:spacing w:val="5"/>
+      <w:color w:val="0F4761"/>
     </w:rPr>
   </w:style>
 </w:styles>

</xml_diff>

<commit_message>
Dateimeister_support: implement delete / create video player depending on visibility after scroll - still to be tested
</commit_message>
<xml_diff>
--- a/Requirement new Videoplayer on Scroll.docx
+++ b/Requirement new Videoplayer on Scroll.docx
@@ -20,7 +20,13 @@
     </w:p>
     <w:p>
       <w:r>
-        <w:t xml:space="preserve">Die Player beanspruchen sehr viel Speicher (&gt; 500 MB), so dass wir nur die Videoplayer der sichtbaren Images anzeigen. Dazu speichern wir am Thumbnail, ob das Bild / Video sichtbar ist. Außerdem gibt es ein Dict der zu einem Zeitpunkt sichtbaren Objekte,mit key = canvas-id und value = thumbnail. Wir verwenden die canvas-id als key, weil wir in is_visible die bbox für das canvas-Objekt benötigen. Das sollte aber kein Problem sein, weil wir ja keine Thumbnails löschen. Das passiert nur, wenn wir beispielsweise neu sortieren, aber dann werden ja auch die Ids neu vergeben, so dass alles wieder passt. Für jedes Objekt dieses Dict prüfen wir, ob es nach dem Scrollen immer noch sichtbar ist. Das machen wir, indem wir über das Dict der sichtbaren Images iterieren und prüfen, ob is_visible für die ID True zurückgibt. Falls nein, wird der Video Player gelöscht (wir verzichten auf ein eigenes „visible“-Attribut am thumbnail, da es gepflegt werden müsste und der bbox-Abgleich in is_visible schnell genug ist). Nach dem Scrollen ermitteln wir, welches Objekt als erstes (links) sichtbar ist. Die linke  Position ist canvas_x. Dazu verwenden wir get_thumbnail_by_position, das auf binäres Suchen umgestellt ist, damit es schnell geht. Ein kleines Detail: wir haben ja gaps zwischen den Images und wegen unseres Scroll-Verfahrens steht da möglichweise gar kein Image, sondern ein gap. Deshalb suchen wir statt mit Start mit Start – gap. Dann iterieren wir über die Liste der Thumbnails, beginnend mit dem ersten links, das wir gerade gefunden haben. Wir prüfen, ob der Player None ist. Falls None (noch nie angelegt oder gelöscht), legen wir einen neuen Player an. Das machen wir für alle Images rechts, solange is_visible True ergibt. </w:t>
+        <w:t xml:space="preserve">Die Player beanspruchen sehr viel Speicher (&gt; 500 MB), so dass wir nur die Videoplayer der sichtbaren Images anzeigen. Dazu gibt es ein Dict der zu einem Zeitpunkt sichtbaren Objekte,mit key = canvas-id und value = thumbnail. </w:t>
+      </w:r>
+      <w:r>
+        <w:t xml:space="preserve">Wir können prüfen ob die am Thumbnail gespeicherte canvas-ID im Dict enthalten ist. Das erspart uns ein eigenes Attribut am thumbnail, das gepflegt werden müsste. </w:t>
+      </w:r>
+      <w:r>
+        <w:t xml:space="preserve">Wir verwenden die canvas-id als key, weil wir in is_visible die bbox für das canvas-Objekt benötigen. Das sollte aber kein Problem sein, weil wir ja keine Thumbnails löschen. Das passiert nur, wenn wir beispielsweise neu sortieren, aber dann werden ja auch die Ids neu vergeben, so dass alles wieder passt. Für jedes Objekt dieses Dict prüfen wir, ob es nach dem Scrollen immer noch sichtbar ist. Das machen wir, indem wir über das Dict der sichtbaren Images iterieren und prüfen, ob is_visible für die ID True zurückgibt. Falls nein, wird der Video Player gelöscht (wir verzichten auf ein eigenes „visible“-Attribut am thumbnail, da es gepflegt werden müsste und der bbox-Abgleich in is_visible schnell genug ist). Nach dem Scrollen ermitteln wir, welches Objekt als erstes (links) sichtbar ist. Die linke  Position ist canvas_x. Dazu verwenden wir get_thumbnail_by_position, das auf binäres Suchen umgestellt ist, damit es schnell geht. Ein kleines Detail: wir haben ja gaps zwischen den Images und wegen unseres Scroll-Verfahrens steht da möglichweise gar kein Image, sondern ein gap. Deshalb suchen wir statt mit Start mit Start – gap. Dann iterieren wir über die Liste der Thumbnails, beginnend mit dem ersten links, das wir gerade gefunden haben. Wir prüfen, ob der Player None ist. Falls None (noch nie angelegt oder gelöscht), legen wir einen neuen Player an. Das machen wir für alle Images rechts, solange is_visible True ergibt. </w:t>
       </w:r>
     </w:p>
     <w:p>
@@ -99,6 +105,7 @@
     <w:lvl w:ilvl="0">
       <w:start w:val="1"/>
       <w:numFmt w:val="none"/>
+      <w:pStyle w:val="berschrift1"/>
       <w:suff w:val="nothing"/>
       <w:lvlText w:val=""/>
       <w:lvlJc w:val="left"/>
@@ -112,6 +119,7 @@
     <w:lvl w:ilvl="1">
       <w:start w:val="1"/>
       <w:numFmt w:val="none"/>
+      <w:pStyle w:val="berschrift2"/>
       <w:suff w:val="nothing"/>
       <w:lvlText w:val=""/>
       <w:lvlJc w:val="left"/>
@@ -125,6 +133,7 @@
     <w:lvl w:ilvl="2">
       <w:start w:val="1"/>
       <w:numFmt w:val="none"/>
+      <w:pStyle w:val="berschrift3"/>
       <w:suff w:val="nothing"/>
       <w:lvlText w:val=""/>
       <w:lvlJc w:val="left"/>
@@ -138,6 +147,7 @@
     <w:lvl w:ilvl="3">
       <w:start w:val="1"/>
       <w:numFmt w:val="none"/>
+      <w:pStyle w:val="berschrift4"/>
       <w:suff w:val="nothing"/>
       <w:lvlText w:val=""/>
       <w:lvlJc w:val="left"/>
@@ -151,6 +161,7 @@
     <w:lvl w:ilvl="4">
       <w:start w:val="1"/>
       <w:numFmt w:val="none"/>
+      <w:pStyle w:val="berschrift5"/>
       <w:suff w:val="nothing"/>
       <w:lvlText w:val=""/>
       <w:lvlJc w:val="left"/>
@@ -164,6 +175,7 @@
     <w:lvl w:ilvl="5">
       <w:start w:val="1"/>
       <w:numFmt w:val="none"/>
+      <w:pStyle w:val="berschrift6"/>
       <w:suff w:val="nothing"/>
       <w:lvlText w:val=""/>
       <w:lvlJc w:val="left"/>
@@ -177,6 +189,7 @@
     <w:lvl w:ilvl="6">
       <w:start w:val="1"/>
       <w:numFmt w:val="none"/>
+      <w:pStyle w:val="berschrift7"/>
       <w:suff w:val="nothing"/>
       <w:lvlText w:val=""/>
       <w:lvlJc w:val="left"/>
@@ -190,6 +203,7 @@
     <w:lvl w:ilvl="7">
       <w:start w:val="1"/>
       <w:numFmt w:val="none"/>
+      <w:pStyle w:val="berschrift8"/>
       <w:suff w:val="nothing"/>
       <w:lvlText w:val=""/>
       <w:lvlJc w:val="left"/>
@@ -203,6 +217,7 @@
     <w:lvl w:ilvl="8">
       <w:start w:val="1"/>
       <w:numFmt w:val="none"/>
+      <w:pStyle w:val="berschrift9"/>
       <w:suff w:val="nothing"/>
       <w:lvlText w:val=""/>
       <w:lvlJc w:val="left"/>
@@ -835,12 +850,12 @@
     <w:semiHidden/>
     <w:unhideWhenUsed/>
   </w:style>
-  <w:style w:type="character" w:customStyle="1" w:styleId="DefaultParagraphFont">
-    <w:name w:val="Default Paragraph Font"/>
+  <w:style w:type="character" w:customStyle="1" w:styleId="Absatz-Standardschriftart1">
+    <w:name w:val="Absatz-Standardschriftart1"/>
   </w:style>
   <w:style w:type="character" w:customStyle="1" w:styleId="berschrift1Zchn">
     <w:name w:val="Überschrift 1 Zchn"/>
-    <w:basedOn w:val="DefaultParagraphFont"/>
+    <w:basedOn w:val="Absatz-Standardschriftart1"/>
     <w:rPr>
       <w:rFonts w:ascii="Aptos Display" w:hAnsi="Aptos Display" w:cs="font1307"/>
       <w:color w:val="0F4761"/>
@@ -850,7 +865,7 @@
   </w:style>
   <w:style w:type="character" w:customStyle="1" w:styleId="berschrift2Zchn">
     <w:name w:val="Überschrift 2 Zchn"/>
-    <w:basedOn w:val="DefaultParagraphFont"/>
+    <w:basedOn w:val="Absatz-Standardschriftart1"/>
     <w:rPr>
       <w:rFonts w:ascii="Aptos Display" w:hAnsi="Aptos Display" w:cs="font1307"/>
       <w:color w:val="0F4761"/>
@@ -860,7 +875,7 @@
   </w:style>
   <w:style w:type="character" w:customStyle="1" w:styleId="berschrift3Zchn">
     <w:name w:val="Überschrift 3 Zchn"/>
-    <w:basedOn w:val="DefaultParagraphFont"/>
+    <w:basedOn w:val="Absatz-Standardschriftart1"/>
     <w:rPr>
       <w:rFonts w:cs="font1307"/>
       <w:color w:val="0F4761"/>
@@ -870,7 +885,7 @@
   </w:style>
   <w:style w:type="character" w:customStyle="1" w:styleId="berschrift4Zchn">
     <w:name w:val="Überschrift 4 Zchn"/>
-    <w:basedOn w:val="DefaultParagraphFont"/>
+    <w:basedOn w:val="Absatz-Standardschriftart1"/>
     <w:rPr>
       <w:rFonts w:cs="font1307"/>
       <w:i/>
@@ -880,7 +895,7 @@
   </w:style>
   <w:style w:type="character" w:customStyle="1" w:styleId="berschrift5Zchn">
     <w:name w:val="Überschrift 5 Zchn"/>
-    <w:basedOn w:val="DefaultParagraphFont"/>
+    <w:basedOn w:val="Absatz-Standardschriftart1"/>
     <w:rPr>
       <w:rFonts w:cs="font1307"/>
       <w:color w:val="0F4761"/>
@@ -888,7 +903,7 @@
   </w:style>
   <w:style w:type="character" w:customStyle="1" w:styleId="berschrift6Zchn">
     <w:name w:val="Überschrift 6 Zchn"/>
-    <w:basedOn w:val="DefaultParagraphFont"/>
+    <w:basedOn w:val="Absatz-Standardschriftart1"/>
     <w:rPr>
       <w:rFonts w:cs="font1307"/>
       <w:i/>
@@ -898,7 +913,7 @@
   </w:style>
   <w:style w:type="character" w:customStyle="1" w:styleId="berschrift7Zchn">
     <w:name w:val="Überschrift 7 Zchn"/>
-    <w:basedOn w:val="DefaultParagraphFont"/>
+    <w:basedOn w:val="Absatz-Standardschriftart1"/>
     <w:rPr>
       <w:rFonts w:cs="font1307"/>
       <w:color w:val="595959"/>
@@ -906,7 +921,7 @@
   </w:style>
   <w:style w:type="character" w:customStyle="1" w:styleId="berschrift8Zchn">
     <w:name w:val="Überschrift 8 Zchn"/>
-    <w:basedOn w:val="DefaultParagraphFont"/>
+    <w:basedOn w:val="Absatz-Standardschriftart1"/>
     <w:rPr>
       <w:rFonts w:cs="font1307"/>
       <w:i/>
@@ -916,7 +931,7 @@
   </w:style>
   <w:style w:type="character" w:customStyle="1" w:styleId="berschrift9Zchn">
     <w:name w:val="Überschrift 9 Zchn"/>
-    <w:basedOn w:val="DefaultParagraphFont"/>
+    <w:basedOn w:val="Absatz-Standardschriftart1"/>
     <w:rPr>
       <w:rFonts w:cs="font1307"/>
       <w:color w:val="272727"/>
@@ -924,7 +939,7 @@
   </w:style>
   <w:style w:type="character" w:customStyle="1" w:styleId="TitelZchn">
     <w:name w:val="Titel Zchn"/>
-    <w:basedOn w:val="DefaultParagraphFont"/>
+    <w:basedOn w:val="Absatz-Standardschriftart1"/>
     <w:rPr>
       <w:rFonts w:ascii="Aptos Display" w:hAnsi="Aptos Display" w:cs="font1307"/>
       <w:spacing w:val="-10"/>
@@ -935,7 +950,7 @@
   </w:style>
   <w:style w:type="character" w:customStyle="1" w:styleId="UntertitelZchn">
     <w:name w:val="Untertitel Zchn"/>
-    <w:basedOn w:val="DefaultParagraphFont"/>
+    <w:basedOn w:val="Absatz-Standardschriftart1"/>
     <w:rPr>
       <w:rFonts w:cs="font1307"/>
       <w:color w:val="595959"/>
@@ -946,16 +961,16 @@
   </w:style>
   <w:style w:type="character" w:customStyle="1" w:styleId="ZitatZchn">
     <w:name w:val="Zitat Zchn"/>
-    <w:basedOn w:val="DefaultParagraphFont"/>
+    <w:basedOn w:val="Absatz-Standardschriftart1"/>
     <w:rPr>
       <w:i/>
       <w:iCs/>
       <w:color w:val="404040"/>
     </w:rPr>
   </w:style>
-  <w:style w:type="character" w:customStyle="1" w:styleId="IntenseEmphasis">
-    <w:name w:val="Intense Emphasis"/>
-    <w:basedOn w:val="DefaultParagraphFont"/>
+  <w:style w:type="character" w:customStyle="1" w:styleId="IntensiveHervorhebung1">
+    <w:name w:val="Intensive Hervorhebung1"/>
+    <w:basedOn w:val="Absatz-Standardschriftart1"/>
     <w:rPr>
       <w:i/>
       <w:iCs/>
@@ -964,16 +979,16 @@
   </w:style>
   <w:style w:type="character" w:customStyle="1" w:styleId="IntensivesZitatZchn">
     <w:name w:val="Intensives Zitat Zchn"/>
-    <w:basedOn w:val="DefaultParagraphFont"/>
+    <w:basedOn w:val="Absatz-Standardschriftart1"/>
     <w:rPr>
       <w:i/>
       <w:iCs/>
       <w:color w:val="0F4761"/>
     </w:rPr>
   </w:style>
-  <w:style w:type="character" w:customStyle="1" w:styleId="IntenseReference">
-    <w:name w:val="Intense Reference"/>
-    <w:basedOn w:val="DefaultParagraphFont"/>
+  <w:style w:type="character" w:customStyle="1" w:styleId="IntensiverVerweis1">
+    <w:name w:val="Intensiver Verweis1"/>
+    <w:basedOn w:val="Absatz-Standardschriftart1"/>
     <w:rPr>
       <w:b/>
       <w:bCs/>
@@ -1064,8 +1079,8 @@
       <w:szCs w:val="28"/>
     </w:rPr>
   </w:style>
-  <w:style w:type="paragraph" w:customStyle="1" w:styleId="Quote">
-    <w:name w:val="Quote"/>
+  <w:style w:type="paragraph" w:customStyle="1" w:styleId="Zitat1">
+    <w:name w:val="Zitat1"/>
     <w:basedOn w:val="Standard"/>
     <w:pPr>
       <w:spacing w:before="160"/>
@@ -1077,15 +1092,15 @@
       <w:color w:val="404040"/>
     </w:rPr>
   </w:style>
-  <w:style w:type="paragraph" w:customStyle="1" w:styleId="ListParagraph">
-    <w:name w:val="List Paragraph"/>
+  <w:style w:type="paragraph" w:customStyle="1" w:styleId="Listenabsatz1">
+    <w:name w:val="Listenabsatz1"/>
     <w:basedOn w:val="Standard"/>
     <w:pPr>
       <w:ind w:left="720"/>
     </w:pPr>
   </w:style>
-  <w:style w:type="paragraph" w:customStyle="1" w:styleId="IntenseQuote">
-    <w:name w:val="Intense Quote"/>
+  <w:style w:type="paragraph" w:customStyle="1" w:styleId="IntensivesZitat1">
+    <w:name w:val="Intensives Zitat1"/>
     <w:basedOn w:val="Standard"/>
     <w:pPr>
       <w:pBdr>

</xml_diff>